<commit_message>
docs(episodes): Ep2 v3 season-order re-points + canon doc corrections
Episode 2 'The Ferryman' re-pointed for the Listener-first season per
bible Ch 6.2: L1 opener now invokes Ep1's goodnight-harbour ritual;
L9n3 keeps Voss Bio unnamed on air until ~Ep5; one Rivermouth
quiet-boats resonance line at L6n4 (villains deliberately unconnected);
aired-so-far audit logged in a v3 change table.

Also: writers-prompt aired-so-far list updated to the new season order;
golden path CaseCash total corrected to its lead table's sum (1,365);
Vega pronouns-unset ruling recorded in the roster; bible Ch 6.2/4.2/7.2
synced and DOCX/PDF exports regenerated.

Co-Authored-By: Claude Fable 5 <noreply@anthropic.com>
Claude-Session: https://claude.ai/code/session_018KAvAyiiRa2EST879iu8mG
</commit_message>
<xml_diff>
--- a/Bible/Ally Quinn Bible.docx
+++ b/Bible/Ally Quinn Bible.docx
@@ -23,7 +23,7 @@
         <w:pStyle w:val="Date"/>
       </w:pPr>
       <w:r>
-        <w:t xml:space="preserve">v2.0 · 11 July 2026</w:t>
+        <w:t xml:space="preserve">v2.0 · 11 July 2026 (rev 12 July)</w:t>
       </w:r>
     </w:p>
     <w:p>
@@ -4322,7 +4322,7 @@
           <w:i/>
           <w:iCs/>
         </w:rPr>
-        <w:t xml:space="preserve">Open canon point (this bible, 2026-07-11): Vega’s pronouns are deliberately unset — no script has featured Vega yet; the first that does decides, on purpose. Flag for the roster at its next revision.</w:t>
+        <w:t xml:space="preserve">Open canon point: Vega’s pronouns are deliberately unset — no script has featured Vega yet; the first that does decides, on purpose. Recorded in the roster (2026-07-12).</w:t>
       </w:r>
     </w:p>
     <w:p>
@@ -9473,7 +9473,7 @@
       </w:r>
     </w:p>
     <w:bookmarkEnd w:id="81"/>
-    <w:bookmarkStart w:id="82" w:name="X84bee266bf27c484fe2135b53ad572d7d684817"/>
+    <w:bookmarkStart w:id="82" w:name="X1134c08849037de4700619875ff57da625fdf28"/>
     <w:p>
       <w:pPr>
         <w:pStyle w:val="Heading2"/>
@@ -9491,7 +9491,7 @@
         <w:t xml:space="preserve"> </w:t>
       </w:r>
       <w:r>
-        <w:t xml:space="preserve">· DRAFT v2 (canon-revised 2026-07-10, not yet locked)</w:t>
+        <w:t xml:space="preserve">· DRAFT v3 (season-order re-points applied 2026-07-12, not yet locked)</w:t>
       </w:r>
     </w:p>
     <w:p>
@@ -9555,7 +9555,7 @@
           <w:b/>
           <w:bCs/>
         </w:rPr>
-        <w:t xml:space="preserve">Required work before lock — callback re-points.</w:t>
+        <w:t xml:space="preserve">Re-points applied in v3 (2026-07-12).</w:t>
       </w:r>
       <w:r>
         <w:t xml:space="preserve"> </w:t>
@@ -9573,67 +9573,55 @@
         <w:t xml:space="preserve"> </w:t>
       </w:r>
       <w:r>
-        <w:t xml:space="preserve">was Episode 1. Its Ep1 callbacks now point at The Listener instead, and each needs a deliberate pass:</w:t>
-      </w:r>
-      <w:r>
-        <w:t xml:space="preserve"> </w:t>
-      </w:r>
-      <w:r>
-        <w:t xml:space="preserve">- L1’s caller currently opens with</w:t>
-      </w:r>
-      <w:r>
-        <w:t xml:space="preserve"> </w:t>
-      </w:r>
-      <w:r>
-        <w:t xml:space="preserve">“You found the ghost student.”</w:t>
-      </w:r>
-      <w:r>
-        <w:t xml:space="preserve"> </w:t>
-      </w:r>
-      <w:r>
-        <w:t xml:space="preserve">Re-point to The Listener (e.g., the Dot Ellis case as the caller’s reason to trust the show — a listener found, a harbour named).</w:t>
-      </w:r>
-      <w:r>
-        <w:t xml:space="preserve"> </w:t>
-      </w:r>
-      <w:r>
-        <w:t xml:space="preserve">- L9n3’s</w:t>
-      </w:r>
-      <w:r>
-        <w:t xml:space="preserve"> </w:t>
-      </w:r>
-      <w:r>
-        <w:t xml:space="preserve">“he stopped chasing — for two years, until Voss Bio. That’s season talk”</w:t>
-      </w:r>
-      <w:r>
-        <w:t xml:space="preserve"> </w:t>
-      </w:r>
-      <w:r>
-        <w:t xml:space="preserve">— Voss Bio is now unaired future canon (Ghost Student slot ~Ep5), so the line must either generalize or become a deliberate forward-seed.</w:t>
-      </w:r>
-      <w:r>
-        <w:t xml:space="preserve"> </w:t>
-      </w:r>
-      <w:r>
-        <w:t xml:space="preserve">- Audit every</w:t>
-      </w:r>
-      <w:r>
-        <w:t xml:space="preserve"> </w:t>
-      </w:r>
-      <w:r>
-        <w:t xml:space="preserve">“you heard/we aired”</w:t>
-      </w:r>
-      <w:r>
-        <w:t xml:space="preserve"> </w:t>
-      </w:r>
-      <w:r>
-        <w:t xml:space="preserve">reference against the new season order.</w:t>
-      </w:r>
-      <w:r>
-        <w:t xml:space="preserve"> </w:t>
-      </w:r>
-      <w:r>
-        <w:t xml:space="preserve">- Opportunity, not obligation: The Listener planted Harbourline and the quiet boats on the same water this episode works — a light connective line (the reach, the night traffic Dot logged) would sew the two cases into one harbour without merging their villains.</w:t>
+        <w:t xml:space="preserve">was Episode 1; its callbacks now point at The Listener. What changed, and what was deliberately preserved:</w:t>
+      </w:r>
+      <w:r>
+        <w:t xml:space="preserve"> </w:t>
+      </w:r>
+      <w:r>
+        <w:t xml:space="preserve">- L1’s caller now opens on The Listener’s goodnight-harbour ritual (</w:t>
+      </w:r>
+      <w:r>
+        <w:t xml:space="preserve">“You say goodnight to the harbour… It kept my father”</w:t>
+      </w:r>
+      <w:r>
+        <w:t xml:space="preserve">) — the caller trusts the show because it listens, not because of a named prior case.</w:t>
+      </w:r>
+      <w:r>
+        <w:t xml:space="preserve"> </w:t>
+      </w:r>
+      <w:r>
+        <w:t xml:space="preserve">- L9n3 generalizes Voss Bio to</w:t>
+      </w:r>
+      <w:r>
+        <w:t xml:space="preserve"> </w:t>
+      </w:r>
+      <w:r>
+        <w:t xml:space="preserve">“another story wouldn’t let him sleep”</w:t>
+      </w:r>
+      <w:r>
+        <w:t xml:space="preserve"> </w:t>
+      </w:r>
+      <w:r>
+        <w:t xml:space="preserve">— the two-year fact survives, the name stays off-air until ~Ep5.</w:t>
+      </w:r>
+      <w:r>
+        <w:t xml:space="preserve"> </w:t>
+      </w:r>
+      <w:r>
+        <w:t xml:space="preserve">- The aired-so-far audit found no other on-air references to prior episodes; the writers-prompt’s aired-so-far list is updated to the new season order.</w:t>
+      </w:r>
+      <w:r>
+        <w:t xml:space="preserve"> </w:t>
+      </w:r>
+      <w:r>
+        <w:t xml:space="preserve">- The optional resonance was taken: one line at L6n4 (</w:t>
+      </w:r>
+      <w:r>
+        <w:t xml:space="preserve">“A friend of the show once counted quiet boats from her window in Rivermouth”</w:t>
+      </w:r>
+      <w:r>
+        <w:t xml:space="preserve">) sews the two cases into one harbour — villain identity deliberately unconnected, reserved for an explicit season decision. Remaining before lock: table read → revision passes → VO LOCK.</w:t>
       </w:r>
     </w:p>
     <w:bookmarkEnd w:id="82"/>
@@ -10080,7 +10068,7 @@
         <w:pStyle w:val="BodyText"/>
       </w:pPr>
       <w:r>
-        <w:t xml:space="preserve">The validated Episode 1 arc: ≈144 T1-equivalent items across 12 leads, paying ≈1,365 CaseCash + 40 energy + 5 ingots total. (The golden path’s summary line says 1,360 while its own lead table sums to 1,365 — flagged for upstream correction; the per-lead table is treated as authoritative here.) The tuning intent: a full FTUE energy tank (100) carries roughly through Phase 1; the pinch lands mid-Phase-2, where the energy-out popup funnel takes over. Bands are narrative pacing as much as economy: Easy leads are story beats you walk into; Very Hard leads (climax, finale) are earned.</w:t>
+        <w:t xml:space="preserve">The validated Episode 1 arc: ≈144 T1-equivalent items across 12 leads, paying 1,365 CaseCash + 40 energy + 5 ingots total (golden path corrected to its lead table’s sum, 2026-07-12). The tuning intent: a full FTUE energy tank (100) carries roughly through Phase 1; the pinch lands mid-Phase-2, where the energy-out popup funnel takes over. Bands are narrative pacing as much as economy: Easy leads are story beats you walk into; Very Hard leads (climax, finale) are earned.</w:t>
       </w:r>
     </w:p>
     <w:bookmarkEnd w:id="89"/>

</xml_diff>